<commit_message>
docs: the home page shows page 2 beside a short table excerpt, and the PHP transcript matches the Blade one
- The picture is page 2, where the repeated header row is visible.
- The tabs show the 20-line course table; the full files sit behind
  "Show the full source". A test fails if the excerpts drift from the
  example sources.
- The PHP transcript puts "Cumulative summary" inside the tinted box, as
  the Blade view does, and drops keepWithNext calls that headings already
  do by default. Transcript PDF, HTML and Word goldens re-recorded.

Co-Authored-By: Claude Opus 5.5 <noreply@anthropic.com>
</commit_message>
<xml_diff>
--- a/site/src/.vuepress/public/examples/transcript.docx
+++ b/site/src/.vuepress/public/examples/transcript.docx
@@ -10699,25 +10699,6 @@
         <w:t xml:space="preserve"/>
       </w:r>
     </w:p>
-    <w:p>
-      <w:pPr>
-        <w:pStyle w:val="Heading3"/>
-        <w:keepNext/>
-        <w:widowControl/>
-        <w:spacing w:after="340" w:line="278" w:lineRule="auto"/>
-      </w:pPr>
-      <w:r>
-        <w:rPr>
-          <w:rFonts w:ascii="Inter" w:hAnsi="Inter" w:cs="Inter"/>
-          <w:b/>
-          <w:bCs/>
-          <w:color w:val="0f172a"/>
-          <w:sz w:val="28"/>
-          <w:szCs w:val="28"/>
-        </w:rPr>
-        <w:t xml:space="preserve">Cumulative summary</w:t>
-      </w:r>
-    </w:p>
     <w:tbl>
       <w:tblPr>
         <w:tblW w:w="10080" w:type="dxa"/>
@@ -10738,8 +10719,7 @@
         </w:tblCellMar>
       </w:tblPr>
       <w:tblGrid>
-        <w:gridCol w:w="8255"/>
-        <w:gridCol w:w="1825"/>
+        <w:gridCol w:w="10080"/>
       </w:tblGrid>
       <w:tr>
         <w:trPr>
@@ -10747,46 +10727,21 @@
         </w:trPr>
         <w:tc>
           <w:tcPr>
-            <w:tcW w:w="8255" w:type="dxa"/>
+            <w:tcW w:w="10080" w:type="dxa"/>
             <w:shd w:val="clear" w:color="auto" w:fill="f8fafc"/>
             <w:tcMar>
               <w:top w:w="240" w:type="dxa"/>
               <w:left w:w="240" w:type="dxa"/>
               <w:bottom w:w="240" w:type="dxa"/>
-              <w:right w:w="0" w:type="dxa"/>
-            </w:tcMar>
-          </w:tcPr>
-          <w:p>
-            <w:pPr>
-              <w:widowControl/>
-              <w:spacing w:line="278" w:lineRule="auto"/>
-            </w:pPr>
-            <w:r>
-              <w:rPr>
-                <w:rFonts w:ascii="Inter" w:hAnsi="Inter" w:cs="Inter"/>
-                <w:color w:val="0f172a"/>
-                <w:sz w:val="20"/>
-                <w:szCs w:val="20"/>
-              </w:rPr>
-              <w:t xml:space="preserve">210 credits attempted, 671.3 quality points.</w:t>
-            </w:r>
-          </w:p>
-        </w:tc>
-        <w:tc>
-          <w:tcPr>
-            <w:tcW w:w="1825" w:type="dxa"/>
-            <w:shd w:val="clear" w:color="auto" w:fill="f8fafc"/>
-            <w:tcMar>
-              <w:top w:w="240" w:type="dxa"/>
-              <w:left w:w="0" w:type="dxa"/>
-              <w:bottom w:w="240" w:type="dxa"/>
               <w:right w:w="240" w:type="dxa"/>
             </w:tcMar>
           </w:tcPr>
           <w:p>
             <w:pPr>
-              <w:widowControl/>
-              <w:spacing w:line="278" w:lineRule="auto"/>
+              <w:pStyle w:val="Heading3"/>
+              <w:keepNext/>
+              <w:widowControl/>
+              <w:spacing w:after="220" w:line="278" w:lineRule="auto"/>
             </w:pPr>
             <w:r>
               <w:rPr>
@@ -10797,7 +10752,87 @@
                 <w:sz w:val="28"/>
                 <w:szCs w:val="28"/>
               </w:rPr>
-              <w:t xml:space="preserve">GPA 3.20</w:t>
+              <w:t xml:space="preserve">Cumulative summary</w:t>
+            </w:r>
+          </w:p>
+          <w:tbl>
+            <w:tblPr>
+              <w:tblW w:w="9600" w:type="dxa"/>
+              <w:tblBorders>
+                <w:top w:val="none" w:sz="0" w:space="0" w:color="auto"/>
+                <w:left w:val="none" w:sz="0" w:space="0" w:color="auto"/>
+                <w:bottom w:val="none" w:sz="0" w:space="0" w:color="auto"/>
+                <w:right w:val="none" w:sz="0" w:space="0" w:color="auto"/>
+                <w:insideH w:val="none" w:sz="0" w:space="0" w:color="auto"/>
+                <w:insideV w:val="none" w:sz="0" w:space="0" w:color="auto"/>
+              </w:tblBorders>
+              <w:tblLayout w:type="fixed"/>
+              <w:tblCellMar>
+                <w:top w:w="1" w:type="dxa"/>
+                <w:left w:w="0" w:type="dxa"/>
+                <w:bottom w:w="0" w:type="dxa"/>
+                <w:right w:w="0" w:type="dxa"/>
+              </w:tblCellMar>
+            </w:tblPr>
+            <w:tblGrid>
+              <w:gridCol w:w="8051"/>
+              <w:gridCol w:w="1549"/>
+            </w:tblGrid>
+            <w:tr>
+              <w:tc>
+                <w:tcPr>
+                  <w:tcW w:w="8051" w:type="dxa"/>
+                </w:tcPr>
+                <w:p>
+                  <w:pPr>
+                    <w:widowControl/>
+                    <w:spacing w:line="278" w:lineRule="auto"/>
+                  </w:pPr>
+                  <w:r>
+                    <w:rPr>
+                      <w:rFonts w:ascii="Inter" w:hAnsi="Inter" w:cs="Inter"/>
+                      <w:color w:val="0f172a"/>
+                      <w:sz w:val="20"/>
+                      <w:szCs w:val="20"/>
+                    </w:rPr>
+                    <w:t xml:space="preserve">210 credits attempted, 671.3 quality points.</w:t>
+                  </w:r>
+                </w:p>
+              </w:tc>
+              <w:tc>
+                <w:tcPr>
+                  <w:tcW w:w="1549" w:type="dxa"/>
+                </w:tcPr>
+                <w:p>
+                  <w:pPr>
+                    <w:widowControl/>
+                    <w:spacing w:line="278" w:lineRule="auto"/>
+                  </w:pPr>
+                  <w:r>
+                    <w:rPr>
+                      <w:rFonts w:ascii="Inter" w:hAnsi="Inter" w:cs="Inter"/>
+                      <w:b/>
+                      <w:bCs/>
+                      <w:color w:val="0f172a"/>
+                      <w:sz w:val="28"/>
+                      <w:szCs w:val="28"/>
+                    </w:rPr>
+                    <w:t xml:space="preserve">GPA 3.20</w:t>
+                  </w:r>
+                </w:p>
+              </w:tc>
+            </w:tr>
+          </w:tbl>
+          <w:p>
+            <w:pPr>
+              <w:spacing w:line="2" w:lineRule="exact"/>
+            </w:pPr>
+            <w:r>
+              <w:rPr>
+                <w:sz w:val="2"/>
+                <w:szCs w:val="2"/>
+              </w:rPr>
+              <w:t xml:space="preserve"/>
             </w:r>
           </w:p>
         </w:tc>

</xml_diff>